<commit_message>
feat(study-guide): integrasikan ensiklopedia 54 sitasi, audit integritas berkas jurnal, dan sinkronisasi tri-format panduan belajar
- Audit komprehensif seluruh 54 sitasi: konfirmasi bebas isu berkas 2 lembar rusak (10 full paper empiris, 9 buku teks internasional, 2 repositori buku ISBN, data industri aktif)
- Penambahan Bagian 22 pada PANDUAN_BELAJAR_PROPOSAL.md: peran ilmiah dan tameng sidang 1 kalimat untuk seluruh 54 pustaka
- Kompilasi sinkronisasi tri-format: Markdown (218 KB), PDF via ReportLab (209 KB), dan standalone HTML (283 KB)
- Regenerasi naskah Word Proposal_Arthur_PokemonTCG.docx (181 sitasi hyperlink, TOC murni hitam, 54 DP bookmark)
- Validasi 10/10 PASS Quality Gates Extended dan 0 tautan sitasi mati
- Pembaruan graphify knowledge graph (2.520 nodes, 2.654 edges) dan pencatatan Obsidian Second Brain Sesi 37
</commit_message>
<xml_diff>
--- a/01_Naskah_Utama/01_Lembar_Persetujuan_Proposal/04_Kata_Pengantar.docx
+++ b/01_Naskah_Utama/01_Lembar_Persetujuan_Proposal/04_Kata_Pengantar.docx
@@ -36,27 +36,7 @@
           <w:color w:val="000000"/>
           <w:rFonts w:ascii="Times New Roman" w:hAnsi="Times New Roman" w:cs="Times New Roman"/>
         </w:rPr>
-        <w:t xml:space="preserve">Puji dan syukur penulis panjatkan ke hadirat Tuhan Yang Maha Esa atas kasih, anugerah, dan penyertaan-Nya yang senantiasa melimpah, sehingga penulis dapat menyelesaikan penyusunan proposal skripsi yang berjudul </w:t>
-      </w:r>
-      <w:r>
-        <w:rPr>
-          <w:b/>
-          <w:i w:val="0"/>
-          <w:sz w:val="24"/>
-          <w:color w:val="000000"/>
-          <w:rFonts w:ascii="Times New Roman" w:hAnsi="Times New Roman" w:cs="Times New Roman"/>
-        </w:rPr>
-        <w:t>“PENGARUH HEDONIC MOTIVATION, DESIRE FOR COMPLETENESS, DAN SPECULATIVE MOTIVE TERHADAP IMPULSIVE BUYING BOOSTER PACK KARTU POKÉMON TCG DENGAN SELF-CONTROL SEBAGAI VARIABEL MODERASI”</w:t>
-      </w:r>
-      <w:r>
-        <w:rPr>
-          <w:b w:val="0"/>
-          <w:i w:val="0"/>
-          <w:sz w:val="24"/>
-          <w:color w:val="000000"/>
-          <w:rFonts w:ascii="Times New Roman" w:hAnsi="Times New Roman" w:cs="Times New Roman"/>
-        </w:rPr>
-        <w:t xml:space="preserve"> dengan baik, lancar, dan tepat waktu.</w:t>
+        <w:t>Puji dan syukur penulis panjatkan ke hadirat Tuhan Yang Maha Esa atas kasih, anugerah, dan penyertaan-Nya yang senantiasa melimpah, sehingga penulis dapat menyelesaikan penyusunan proposal skripsi yang berjudul “PENGARUH HEDONIC MOTIVATION, DESIRE FOR COMPLETENESS, DAN SPECULATIVE MOTIVE TERHADAP IMPULSIVE BUYING BOOSTER PACK KARTU POKÉMON TCG DENGAN SELF-CONTROL SEBAGAI VARIABEL MODERASI (STUDI PADA KONSUMEN DI JAKARTA BARAT)” dengan baik, lancar, dan tepat waktu.</w:t>
       </w:r>
     </w:p>
     <w:p>
@@ -258,7 +238,7 @@
           <w:color w:val="000000"/>
           <w:rFonts w:ascii="Times New Roman" w:hAnsi="Times New Roman" w:cs="Times New Roman"/>
         </w:rPr>
-        <w:t>Komunitas Kolektor dan Pemain Pokémon TCG di Indonesia, yang telah memberikan gambaran nyata mengenai fenomena pasar kartu koleksi di lapangan.</w:t>
+        <w:t>Komunitas Kolektor dan Pemain Pokémon TCG di Jakarta Barat dan Indonesia, yang telah memberikan gambaran nyata mengenai fenomena pasar kartu koleksi di lapangan.</w:t>
       </w:r>
     </w:p>
     <w:p>

</xml_diff>